<commit_message>
fix(informe): corregir el autovalor mínimo del modelo gaussiano y hacerlo reproducible
La auditoría de los entregables encontró que el informe afirmaba un autovalor
mínimo "del orden de 10⁻⁵" para el gaussiano, número que no salía de ninguna
corrida del script: 10⁻⁵ corresponde a la combinación lineal+gaussiano, no a la
cuadrática que se compara en esa tabla. El valor real es 0,0086 frente a 9,13
del esférico.

- Nuevo bloque 7.3b: imprime los autovalores de Sigma para las seis
  combinaciones, de modo que la afirmación del informe quede respaldada por la
  salida del script.
- El script ahora localiza los rásteres aunque no estén en la ruta por defecto,
  para que corra entregado suelto junto a los datos.
- Se agregan al Word los prompts del día de la entrega.

Co-Authored-By: Claude Opus 5 (1M context) <noreply@anthropic.com>
</commit_message>
<xml_diff>
--- a/Prompts IA - Proyecto 1 AnalíticaDeDatos.docx
+++ b/Prompts IA - Proyecto 1 AnalíticaDeDatos.docx
@@ -1348,6 +1348,42 @@
         <w:t xml:space="preserve">por el momento solo pon mi correo y abre el pdf y dame el link del repo quiero estudiarlo todo</w:t>
       </w:r>
     </w:p>
+    <w:p>
+      <w:pPr>
+        <w:pStyle w:val="BodyText"/>
+      </w:pPr>
+      <w:r>
+        <w:rPr>
+          <w:bCs/>
+          <w:b/>
+        </w:rPr>
+        <w:t xml:space="preserve">[14:30]</w:t>
+      </w:r>
+      <w:r>
+        <w:t xml:space="preserve"> </w:t>
+      </w:r>
+      <w:r>
+        <w:t xml:space="preserve">ya hoy es el dia de la entrega entonces dale una verificacion solo a lo que nos piden entregar</w:t>
+      </w:r>
+    </w:p>
+    <w:p>
+      <w:pPr>
+        <w:pStyle w:val="BodyText"/>
+      </w:pPr>
+      <w:r>
+        <w:rPr>
+          <w:bCs/>
+          <w:b/>
+        </w:rPr>
+        <w:t xml:space="preserve">[14:50]</w:t>
+      </w:r>
+      <w:r>
+        <w:t xml:space="preserve"> </w:t>
+      </w:r>
+      <w:r>
+        <w:t xml:space="preserve">dale una auditoria a los entregables</w:t>
+      </w:r>
+    </w:p>
     <w:bookmarkEnd w:id="24"/>
     <w:bookmarkEnd w:id="25"/>
     <w:bookmarkStart w:id="26" w:name="nota-sobre-reproducibilidad"/>
@@ -1388,7 +1424,7 @@
         <w:t xml:space="preserve">Rscript R/proyecto1.R</w:t>
       </w:r>
       <w:r>
-        <w:t xml:space="preserve">) y regenera por sí solo las 26 figuras y las 5 tablas que cita el informe. Repositorio del grupo: https://github.com/Juan-maya935/Proyecto1_Analitic</w:t>
+        <w:t xml:space="preserve">) y regenera por sí solo las 26 imágenes —que el informe agrupa en 15 figuras— y las 5 tablas de resultados. Se verificó en una carpeta limpia, con el script y los datos como única entrada. Repositorio del grupo: https://github.com/Juan-maya935/Proyecto1_Analitic</w:t>
       </w:r>
     </w:p>
     <w:bookmarkEnd w:id="26"/>

</xml_diff>

<commit_message>
docs(prompts): corregir el documento de prompts de IA y actualizar el checklist
- Se añade el código de Juan Pablo Maya (2236377), que faltaba en la portada.
- El prompt del 13-sep 04:50 traía pegada la conversación del grupo con
  nombres de compañeros; se deja la objeción metodológica y se retira el
  pegado literal.
- Se retira el prompt del 12-sep 06:42, que solo contenía metadatos de la
  sesión y ningún contenido del proyecto.
- Se añaden los dos prompts del cierre de la entrega (13-sep 15:05 y 15:20).
- La nota de reproducibilidad decía 26 imágenes y 15 figuras; son 27 imágenes,
  16 usadas en el informe, agrupadas en 10 figuras numeradas, y 5 tablas.

Co-Authored-By: Claude Opus 5 (1M context) <noreply@anthropic.com>
</commit_message>
<xml_diff>
--- a/Prompts IA - Proyecto 1 AnalíticaDeDatos.docx
+++ b/Prompts IA - Proyecto 1 AnalíticaDeDatos.docx
@@ -46,10 +46,9 @@
         <w:t xml:space="preserve"> </w:t>
       </w:r>
       <w:r>
-        <w:t xml:space="preserve">César Armando Reyes Oliveros (2236379) · Yesenia Díaz (2231783) · Juan Pablo Maya</w:t>
-      </w:r>
-    </w:p>
-    <w:bookmarkStart w:id="20" w:name="herramienta-empleada"/>
+        <w:t xml:space="preserve">César Armando Reyes Oliveros (2236379) · Yesenia Díaz (2231783) · Juan Pablo Maya (2236377)</w:t>
+      </w:r>
+    </w:p>
     <w:p>
       <w:pPr>
         <w:pStyle w:val="Heading2"/>
@@ -102,8 +101,6 @@
         <w:t xml:space="preserve">. No se utilizó ninguna otra herramienta de IA generativa (no se usaron ChatGPT, Gemini ni DeepSeek).</w:t>
       </w:r>
     </w:p>
-    <w:bookmarkEnd w:id="20"/>
-    <w:bookmarkStart w:id="21" w:name="para-qué-se-usó-y-para-qué-no"/>
     <w:p>
       <w:pPr>
         <w:pStyle w:val="Heading2"/>
@@ -275,8 +272,6 @@
         <w:t xml:space="preserve">, no de la herramienta.</w:t>
       </w:r>
     </w:p>
-    <w:bookmarkEnd w:id="21"/>
-    <w:bookmarkStart w:id="25" w:name="listado-de-prompts"/>
     <w:p>
       <w:pPr>
         <w:pStyle w:val="Heading2"/>
@@ -293,7 +288,6 @@
         <w:t xml:space="preserve">Se transcriben los prompts tal como fueron escritos (incluidas las erratas de tipeo). Se omitieron las confirmaciones de una palabra del tipo «dale», «listo?» o «sigue», que no aportan contenido.</w:t>
       </w:r>
     </w:p>
-    <w:bookmarkStart w:id="22" w:name="X03707e98aee9e39ff65b89ec073f94c3410b841"/>
     <w:p>
       <w:pPr>
         <w:pStyle w:val="Heading3"/>
@@ -518,8 +512,6 @@
         <w:t xml:space="preserve">dale una auditoria para ver que todo quedo correcto</w:t>
       </w:r>
     </w:p>
-    <w:bookmarkEnd w:id="22"/>
-    <w:bookmarkStart w:id="23" w:name="X054fbd9bf8c84da68e988d01f7d5cddca74d77e"/>
     <w:p>
       <w:pPr>
         <w:pStyle w:val="Heading3"/>
@@ -1131,24 +1123,6 @@
           <w:bCs/>
           <w:b/>
         </w:rPr>
-        <w:t xml:space="preserve">[06:42]</w:t>
-      </w:r>
-      <w:r>
-        <w:t xml:space="preserve"> </w:t>
-      </w:r>
-      <w:r>
-        <w:t xml:space="preserve">recuerdas el contexto de esta seccion ? Version: 2.1.268 Session name: Como estás Session ID: 47c31389-6f3b-45f3-9abb-a116b91e88da</w:t>
-      </w:r>
-    </w:p>
-    <w:p>
-      <w:pPr>
-        <w:pStyle w:val="BodyText"/>
-      </w:pPr>
-      <w:r>
-        <w:rPr>
-          <w:bCs/>
-          <w:b/>
-        </w:rPr>
         <w:t xml:space="preserve">[06:53]</w:t>
       </w:r>
       <w:r>
@@ -1230,8 +1204,6 @@
         <w:t xml:space="preserve">lo quiero en la rama main ya</w:t>
       </w:r>
     </w:p>
-    <w:bookmarkEnd w:id="23"/>
-    <w:bookmarkStart w:id="24" w:name="X5274f063f445564f29cd823e822d8d971478091"/>
     <w:p>
       <w:pPr>
         <w:pStyle w:val="Heading3"/>
@@ -1273,7 +1245,7 @@
         <w:t xml:space="preserve"> </w:t>
       </w:r>
       <w:r>
-        <w:t xml:space="preserve">estoy asustado , te comento , en eso que hicimos pues la idea es usar unicamente lo mostrado en clase y hoy una compa;era me hizo esta anotacion , entre en panico ( No podemos hacer solo kriging Porque el proyecto es multivariado Claro pero lo que hicimos fue usarlo 2 veces ordinario sobre los residuos de la tendencia, sumándole después la deriva (o sea kriging residual/universal) Lo remuestrearon? Has respondido a Sara Rojas lo validamos con loocv Y eso cuando lo vimos? Eso más la predicción de la grilla Has respondido a Sara Rojas Está en el material de la clase Sara Rojas te ha respondido Kriging sii Pero loocv Vos decís que lo saco y le meto vecinos ? Porque esta en el material del curso Es que aún no sabemos Todos tienen cosas diferentes Estábamos pensando en FMA y luego knn) me lo pudes validar ? si estamos usando unicamente lo visto en clase o si nos sacamos algo de la manga ?</w:t>
+        <w:t xml:space="preserve">estoy asustado , te comento , en eso que hicimos pues la idea es usar unicamente lo mostrado en clase y hoy una compa;era me hizo esta anotacion , entre en panico ( que el proyecto es multivariado y que nosotros usamos kriging dos veces: ordinario sobre los residuos de la tendencia y sumandole despues la deriva, o sea kriging residual/universal ; que cuando vimos LOOCV ; que el grupo estaba pensando en FMA y luego kNN ) me lo pudes validar ? si estamos usando unicamente lo visto en clase o si nos sacamos algo de la manga ?   [se omite el pegado literal de la conversacion del grupo, que incluye nombres de companeros]</w:t>
       </w:r>
     </w:p>
     <w:p>
@@ -1384,9 +1356,42 @@
         <w:t xml:space="preserve">dale una auditoria a los entregables</w:t>
       </w:r>
     </w:p>
-    <w:bookmarkEnd w:id="24"/>
-    <w:bookmarkEnd w:id="25"/>
-    <w:bookmarkStart w:id="26" w:name="nota-sobre-reproducibilidad"/>
+    <w:p>
+      <w:pPr>
+        <w:pStyle w:val="BodyText"/>
+      </w:pPr>
+      <w:r>
+        <w:rPr>
+          <w:bCs/>
+          <w:b/>
+        </w:rPr>
+        <w:t xml:space="preserve">[15:05]</w:t>
+      </w:r>
+      <w:r>
+        <w:t xml:space="preserve"> </w:t>
+      </w:r>
+      <w:r>
+        <w:t xml:space="preserve">no terminaste lo de esta seccion (verificacion de la entrega)</w:t>
+      </w:r>
+    </w:p>
+    <w:p>
+      <w:pPr>
+        <w:pStyle w:val="BodyText"/>
+      </w:pPr>
+      <w:r>
+        <w:rPr>
+          <w:bCs/>
+          <w:b/>
+        </w:rPr>
+        <w:t xml:space="preserve">[15:20]</w:t>
+      </w:r>
+      <w:r>
+        <w:t xml:space="preserve"> </w:t>
+      </w:r>
+      <w:r>
+        <w:t xml:space="preserve">abrelo y asi lo vemos y hazle una auditoria a las cosas que debemos subir si o si y me gustraia agrega los de los pronts usados para ia dame recomendaciones que no nos pongan tan mal</w:t>
+      </w:r>
+    </w:p>
     <w:p>
       <w:pPr>
         <w:pStyle w:val="Heading2"/>
@@ -1400,31 +1405,7 @@
         <w:pStyle w:val="FirstParagraph"/>
       </w:pPr>
       <w:r>
-        <w:t xml:space="preserve">El archivo</w:t>
-      </w:r>
-      <w:r>
-        <w:t xml:space="preserve"> </w:t>
-      </w:r>
-      <w:r>
-        <w:rPr>
-          <w:rStyle w:val="VerbatimChar"/>
-        </w:rPr>
-        <w:t xml:space="preserve">proyecto1.R</w:t>
-      </w:r>
-      <w:r>
-        <w:t xml:space="preserve"> </w:t>
-      </w:r>
-      <w:r>
-        <w:t xml:space="preserve">que se entrega corre completo de principio a fin (</w:t>
-      </w:r>
-      <w:r>
-        <w:rPr>
-          <w:rStyle w:val="VerbatimChar"/>
-        </w:rPr>
-        <w:t xml:space="preserve">Rscript R/proyecto1.R</w:t>
-      </w:r>
-      <w:r>
-        <w:t xml:space="preserve">) y regenera por sí solo las 26 imágenes —que el informe agrupa en 15 figuras— y las 5 tablas de resultados. Se verificó en una carpeta limpia, con el script y los datos como única entrada. Repositorio del grupo: https://github.com/Juan-maya935/Proyecto1_Analitic</w:t>
+        <w:t xml:space="preserve">El archivo proyecto1.R que se entrega corre completo de principio a fin (Rscript R/proyecto1.R, salida 0) y regenera por si solo las 27 imagenes de la carpeta resultados/ —de las cuales el informe usa 16, agrupadas en 10 figuras numeradas— y las 5 tablas en CSV. Se verifico en una carpeta limpia, con el script y los datos como unica entrada. Repositorio del grupo: https://github.com/Juan-maya935/Proyecto1_Analitic</w:t>
       </w:r>
     </w:p>
     <w:bookmarkEnd w:id="26"/>

</xml_diff>

<commit_message>
docs(prompts): reducir el prompt del 04:50 y retirar el del 15:20
Decisión de César sobre el documento de prompts:

- El prompt del 13-sep 04:50 queda en una línea con la pregunta de fondo
  (si el enfoque usa únicamente métodos vistos en clase). Se retira el
  detalle de la objeción, que venía de una conversación del grupo.
- Se retira el prompt del 13-sep 15:20.
- No se añaden secciones nuevas: el documento cumple el enunciado con la
  herramienta declarada y el listado de prompts.

Co-Authored-By: Claude Opus 5 (1M context) <noreply@anthropic.com>
</commit_message>
<xml_diff>
--- a/Prompts IA - Proyecto 1 AnalíticaDeDatos.docx
+++ b/Prompts IA - Proyecto 1 AnalíticaDeDatos.docx
@@ -1245,7 +1245,7 @@
         <w:t xml:space="preserve"> </w:t>
       </w:r>
       <w:r>
-        <w:t xml:space="preserve">estoy asustado , te comento , en eso que hicimos pues la idea es usar unicamente lo mostrado en clase y hoy una compa;era me hizo esta anotacion , entre en panico ( que el proyecto es multivariado y que nosotros usamos kriging dos veces: ordinario sobre los residuos de la tendencia y sumandole despues la deriva, o sea kriging residual/universal ; que cuando vimos LOOCV ; que el grupo estaba pensando en FMA y luego kNN ) me lo pudes validar ? si estamos usando unicamente lo visto en clase o si nos sacamos algo de la manga ?   [se omite el pegado literal de la conversacion del grupo, que incluye nombres de companeros]</w:t>
+        <w:t xml:space="preserve">pregunte si lo que hicimos usa unicamente metodos vistos en clase o si nos sacamos algo de la manga</w:t>
       </w:r>
     </w:p>
     <w:p>
@@ -1372,24 +1372,6 @@
       </w:r>
       <w:r>
         <w:t xml:space="preserve">no terminaste lo de esta seccion (verificacion de la entrega)</w:t>
-      </w:r>
-    </w:p>
-    <w:p>
-      <w:pPr>
-        <w:pStyle w:val="BodyText"/>
-      </w:pPr>
-      <w:r>
-        <w:rPr>
-          <w:bCs/>
-          <w:b/>
-        </w:rPr>
-        <w:t xml:space="preserve">[15:20]</w:t>
-      </w:r>
-      <w:r>
-        <w:t xml:space="preserve"> </w:t>
-      </w:r>
-      <w:r>
-        <w:t xml:space="preserve">abrelo y asi lo vemos y hazle una auditoria a las cosas que debemos subir si o si y me gustraia agrega los de los pronts usados para ia dame recomendaciones que no nos pongan tan mal</w:t>
       </w:r>
     </w:p>
     <w:p>

</xml_diff>